<commit_message>
small fixes and slide content for py03
</commit_message>
<xml_diff>
--- a/static/pages/course_model/py03-pandas-load-filter/predict_outcomes_inclass.docx
+++ b/static/pages/course_model/py03-pandas-load-filter/predict_outcomes_inclass.docx
@@ -1,6 +1,6 @@
 
 <file path=word/document.xml><?xml version="1.0" encoding="utf-8"?>
-<w:document xmlns:wpc="http://schemas.microsoft.com/office/word/2010/wordprocessingCanvas" xmlns:cx="http://schemas.microsoft.com/office/drawing/2014/chartex" xmlns:cx1="http://schemas.microsoft.com/office/drawing/2015/9/8/chartex" xmlns:cx2="http://schemas.microsoft.com/office/drawing/2015/10/21/chartex" xmlns:cx3="http://schemas.microsoft.com/office/drawing/2016/5/9/chartex" xmlns:cx4="http://schemas.microsoft.com/office/drawing/2016/5/10/chartex" xmlns:cx5="http://schemas.microsoft.com/office/drawing/2016/5/11/chartex" xmlns:cx6="http://schemas.microsoft.com/office/drawing/2016/5/12/chartex" xmlns:cx7="http://schemas.microsoft.com/office/drawing/2016/5/13/chartex" xmlns:cx8="http://schemas.microsoft.com/office/drawing/2016/5/14/chartex" xmlns:mc="http://schemas.openxmlformats.org/markup-compatibility/2006" xmlns:aink="http://schemas.microsoft.com/office/drawing/2016/ink" xmlns:am3d="http://schemas.microsoft.com/office/drawing/2017/model3d" xmlns:o="urn:schemas-microsoft-com:office:office" xmlns:oel="http://schemas.microsoft.com/office/2019/extlst" xmlns:r="http://schemas.openxmlformats.org/officeDocument/2006/relationships" xmlns:m="http://schemas.openxmlformats.org/officeDocument/2006/math" xmlns:v="urn:schemas-microsoft-com:vml" xmlns:wp14="http://schemas.microsoft.com/office/word/2010/wordprocessingDrawing" xmlns:wp="http://schemas.openxmlformats.org/drawingml/2006/wordprocessingDrawing" xmlns:w10="urn:schemas-microsoft-com:office:word" xmlns:w="http://schemas.openxmlformats.org/wordprocessingml/2006/main" xmlns:w14="http://schemas.microsoft.com/office/word/2010/wordml" xmlns:w15="http://schemas.microsoft.com/office/word/2012/wordml" xmlns:w16cex="http://schemas.microsoft.com/office/word/2018/wordml/cex" xmlns:w16cid="http://schemas.microsoft.com/office/word/2016/wordml/cid" xmlns:w16="http://schemas.microsoft.com/office/word/2018/wordml" xmlns:w16du="http://schemas.microsoft.com/office/word/2023/wordml/word16du" xmlns:w16sdtdh="http://schemas.microsoft.com/office/word/2020/wordml/sdtdatahash" xmlns:w16sdtfl="http://schemas.microsoft.com/office/word/2024/wordml/sdtformatlock" xmlns:w16se="http://schemas.microsoft.com/office/word/2015/wordml/symex" xmlns:wpg="http://schemas.microsoft.com/office/word/2010/wordprocessingGroup" xmlns:wpi="http://schemas.microsoft.com/office/word/2010/wordprocessingInk" xmlns:wne="http://schemas.microsoft.com/office/word/2006/wordml" xmlns:wps="http://schemas.microsoft.com/office/word/2010/wordprocessingShape" mc:Ignorable="w14 w15 w16se w16cid w16 w16cex w16sdtdh w16sdtfl w16du wp14">
+<w:document xmlns:wpc="http://schemas.microsoft.com/office/word/2010/wordprocessingCanvas" xmlns:cx="http://schemas.microsoft.com/office/drawing/2014/chartex" xmlns:cx1="http://schemas.microsoft.com/office/drawing/2015/9/8/chartex" xmlns:cx2="http://schemas.microsoft.com/office/drawing/2015/10/21/chartex" xmlns:cx3="http://schemas.microsoft.com/office/drawing/2016/5/9/chartex" xmlns:cx4="http://schemas.microsoft.com/office/drawing/2016/5/10/chartex" xmlns:cx5="http://schemas.microsoft.com/office/drawing/2016/5/11/chartex" xmlns:cx6="http://schemas.microsoft.com/office/drawing/2016/5/12/chartex" xmlns:cx7="http://schemas.microsoft.com/office/drawing/2016/5/13/chartex" xmlns:cx8="http://schemas.microsoft.com/office/drawing/2016/5/14/chartex" xmlns:mc="http://schemas.openxmlformats.org/markup-compatibility/2006" xmlns:m="http://schemas.openxmlformats.org/officeDocument/2006/math" xmlns:aink="http://schemas.microsoft.com/office/drawing/2016/ink" xmlns:am3d="http://schemas.microsoft.com/office/drawing/2017/model3d" xmlns:oel="http://schemas.microsoft.com/office/2019/extlst" xmlns:r="http://schemas.openxmlformats.org/officeDocument/2006/relationships" xmlns:wp14="http://schemas.microsoft.com/office/word/2010/wordprocessingDrawing" xmlns:wp="http://schemas.openxmlformats.org/drawingml/2006/wordprocessingDrawing" xmlns:wpg="http://schemas.microsoft.com/office/word/2010/wordprocessingGroup" xmlns:wpi="http://schemas.microsoft.com/office/word/2010/wordprocessingInk" xmlns:wps="http://schemas.microsoft.com/office/word/2010/wordprocessingShape" xmlns:o="urn:schemas-microsoft-com:office:office" xmlns:v="urn:schemas-microsoft-com:vml" xmlns:w10="urn:schemas-microsoft-com:office:word" xmlns:w="http://schemas.openxmlformats.org/wordprocessingml/2006/main" xmlns:w14="http://schemas.microsoft.com/office/word/2010/wordml" xmlns:w15="http://schemas.microsoft.com/office/word/2012/wordml" xmlns:w16cex="http://schemas.microsoft.com/office/word/2018/wordml/cex" xmlns:w16cid="http://schemas.microsoft.com/office/word/2016/wordml/cid" xmlns:w16="http://schemas.microsoft.com/office/word/2018/wordml" xmlns:w16sdtdh="http://schemas.microsoft.com/office/word/2020/wordml/sdtdatahash" xmlns:w16sdtfl="http://schemas.microsoft.com/office/word/2024/wordml/sdtformatlock" xmlns:w16se="http://schemas.microsoft.com/office/word/2015/wordml/symex" xmlns:w16du="http://schemas.microsoft.com/office/word/2023/wordml/word16du" xmlns:wne="http://schemas.microsoft.com/office/word/2006/wordml" mc:Ignorable="w14 w15 w16se w16cid w16 w16cex w16sdtdh w16sdtfl w16du wp14">
   <w:body>
     <w:p>
       <w:pPr>
@@ -116,7 +116,6 @@
                 <w14:ligatures w14:val="none"/>
               </w:rPr>
             </w:pPr>
-            <w:proofErr w:type="spellStart"/>
             <w:r>
               <w:rPr>
                 <w:rStyle w:val="n"/>
@@ -126,69 +125,7 @@
                 <w:szCs w:val="20"/>
                 <w14:ligatures w14:val="none"/>
               </w:rPr>
-              <w:t>df</w:t>
-            </w:r>
-            <w:proofErr w:type="spellEnd"/>
-            <w:r>
-              <w:rPr>
-                <w:rStyle w:val="n"/>
-                <w:rFonts w:ascii="Courier New" w:eastAsiaTheme="majorEastAsia" w:hAnsi="Courier New" w:cs="Courier New"/>
-                <w:kern w:val="0"/>
-                <w:sz w:val="20"/>
-                <w:szCs w:val="20"/>
-                <w14:ligatures w14:val="none"/>
-              </w:rPr>
-              <w:t xml:space="preserve"> = </w:t>
-            </w:r>
-            <w:proofErr w:type="spellStart"/>
-            <w:proofErr w:type="gramStart"/>
-            <w:r>
-              <w:rPr>
-                <w:rStyle w:val="n"/>
-                <w:rFonts w:ascii="Courier New" w:eastAsiaTheme="majorEastAsia" w:hAnsi="Courier New" w:cs="Courier New"/>
-                <w:kern w:val="0"/>
-                <w:sz w:val="20"/>
-                <w:szCs w:val="20"/>
-                <w14:ligatures w14:val="none"/>
-              </w:rPr>
-              <w:t>pd.DataFrame</w:t>
-            </w:r>
-            <w:proofErr w:type="spellEnd"/>
-            <w:proofErr w:type="gramEnd"/>
-            <w:r>
-              <w:rPr>
-                <w:rStyle w:val="n"/>
-                <w:rFonts w:ascii="Courier New" w:eastAsiaTheme="majorEastAsia" w:hAnsi="Courier New" w:cs="Courier New"/>
-                <w:kern w:val="0"/>
-                <w:sz w:val="20"/>
-                <w:szCs w:val="20"/>
-                <w14:ligatures w14:val="none"/>
-              </w:rPr>
-              <w:t>({'id': [100, 101, 102], 'name': ['</w:t>
-            </w:r>
-            <w:proofErr w:type="spellStart"/>
-            <w:r>
-              <w:rPr>
-                <w:rStyle w:val="n"/>
-                <w:rFonts w:ascii="Courier New" w:eastAsiaTheme="majorEastAsia" w:hAnsi="Courier New" w:cs="Courier New"/>
-                <w:kern w:val="0"/>
-                <w:sz w:val="20"/>
-                <w:szCs w:val="20"/>
-                <w14:ligatures w14:val="none"/>
-              </w:rPr>
-              <w:t>tim</w:t>
-            </w:r>
-            <w:proofErr w:type="spellEnd"/>
-            <w:r>
-              <w:rPr>
-                <w:rStyle w:val="n"/>
-                <w:rFonts w:ascii="Courier New" w:eastAsiaTheme="majorEastAsia" w:hAnsi="Courier New" w:cs="Courier New"/>
-                <w:kern w:val="0"/>
-                <w:sz w:val="20"/>
-                <w:szCs w:val="20"/>
-                <w14:ligatures w14:val="none"/>
-              </w:rPr>
-              <w:t>', 'bob', None]})</w:t>
+              <w:t>df = pd.DataFrame({'id': [100, 101, 102], 'name': ['tim', 'bob', None]})</w:t>
             </w:r>
           </w:p>
           <w:p>
@@ -203,8 +140,6 @@
               </w:rPr>
               <w:t xml:space="preserve">sales = </w:t>
             </w:r>
-            <w:proofErr w:type="spellStart"/>
-            <w:proofErr w:type="gramStart"/>
             <w:r>
               <w:rPr>
                 <w:rStyle w:val="n"/>
@@ -214,20 +149,7 @@
                 <w:szCs w:val="20"/>
                 <w14:ligatures w14:val="none"/>
               </w:rPr>
-              <w:t>pd.Series</w:t>
-            </w:r>
-            <w:proofErr w:type="spellEnd"/>
-            <w:proofErr w:type="gramEnd"/>
-            <w:r>
-              <w:rPr>
-                <w:rStyle w:val="n"/>
-                <w:rFonts w:ascii="Courier New" w:eastAsiaTheme="majorEastAsia" w:hAnsi="Courier New" w:cs="Courier New"/>
-                <w:kern w:val="0"/>
-                <w:sz w:val="20"/>
-                <w:szCs w:val="20"/>
-                <w14:ligatures w14:val="none"/>
-              </w:rPr>
-              <w:t>([1, 2, 3])</w:t>
+              <w:t>pd.Series([1, 2, 3])</w:t>
             </w:r>
           </w:p>
         </w:tc>
@@ -310,13 +232,8 @@
             <w:pPr>
               <w:pStyle w:val="HTMLPreformatted"/>
             </w:pPr>
-            <w:proofErr w:type="spellStart"/>
-            <w:r>
-              <w:t>df</w:t>
-            </w:r>
-            <w:proofErr w:type="spellEnd"/>
-            <w:r>
-              <w:t>['id']</w:t>
+            <w:r>
+              <w:t>df['id']</w:t>
             </w:r>
           </w:p>
           <w:p>
@@ -343,21 +260,13 @@
           <w:tcPr>
             <w:tcW w:w="3258" w:type="dxa"/>
           </w:tcPr>
-          <w:p>
-            <w:r>
-              <w:t>Not defined</w:t>
-            </w:r>
-          </w:p>
-        </w:tc>
-        <w:tc>
-          <w:tcPr>
-            <w:tcW w:w="3258" w:type="dxa"/>
-          </w:tcPr>
-          <w:p>
-            <w:r>
-              <w:t>Error</w:t>
-            </w:r>
-          </w:p>
+          <w:p/>
+        </w:tc>
+        <w:tc>
+          <w:tcPr>
+            <w:tcW w:w="3258" w:type="dxa"/>
+          </w:tcPr>
+          <w:p/>
         </w:tc>
       </w:tr>
       <w:tr>
@@ -374,15 +283,7 @@
               <w:pStyle w:val="HTMLPreformatted"/>
             </w:pPr>
             <w:r>
-              <w:t xml:space="preserve">x = </w:t>
-            </w:r>
-            <w:proofErr w:type="spellStart"/>
-            <w:r>
-              <w:t>df</w:t>
-            </w:r>
-            <w:proofErr w:type="spellEnd"/>
-            <w:r>
-              <w:t>['id']</w:t>
+              <w:t>x = df['id']</w:t>
             </w:r>
           </w:p>
           <w:p>
@@ -403,21 +304,13 @@
           <w:tcPr>
             <w:tcW w:w="3258" w:type="dxa"/>
           </w:tcPr>
-          <w:p>
-            <w:r>
-              <w:t>Series 100, 101, 102</w:t>
-            </w:r>
-          </w:p>
-        </w:tc>
-        <w:tc>
-          <w:tcPr>
-            <w:tcW w:w="3258" w:type="dxa"/>
-          </w:tcPr>
-          <w:p>
-            <w:r>
-              <w:t>100, 101, 102</w:t>
-            </w:r>
-          </w:p>
+          <w:p/>
+        </w:tc>
+        <w:tc>
+          <w:tcPr>
+            <w:tcW w:w="3258" w:type="dxa"/>
+          </w:tcPr>
+          <w:p/>
         </w:tc>
       </w:tr>
       <w:tr>
@@ -437,15 +330,7 @@
               <w:t>x</w:t>
             </w:r>
             <w:r>
-              <w:t xml:space="preserve"> = </w:t>
-            </w:r>
-            <w:proofErr w:type="spellStart"/>
-            <w:r>
-              <w:t>df</w:t>
-            </w:r>
-            <w:proofErr w:type="spellEnd"/>
-            <w:r>
-              <w:t>['</w:t>
+              <w:t xml:space="preserve"> = df['</w:t>
             </w:r>
             <w:r>
               <w:t>name</w:t>
@@ -465,37 +350,21 @@
               <w:pStyle w:val="HTMLPreformatted"/>
             </w:pPr>
             <w:r>
-              <w:t>print(</w:t>
-            </w:r>
-            <w:proofErr w:type="gramStart"/>
-            <w:r>
-              <w:t>x[</w:t>
-            </w:r>
-            <w:proofErr w:type="gramEnd"/>
-            <w:r>
-              <w:t>0])</w:t>
-            </w:r>
-          </w:p>
-        </w:tc>
-        <w:tc>
-          <w:tcPr>
-            <w:tcW w:w="3258" w:type="dxa"/>
-          </w:tcPr>
-          <w:p>
-            <w:r>
-              <w:t>False, True, False</w:t>
-            </w:r>
-          </w:p>
-        </w:tc>
-        <w:tc>
-          <w:tcPr>
-            <w:tcW w:w="3258" w:type="dxa"/>
-          </w:tcPr>
-          <w:p>
-            <w:r>
-              <w:t>False</w:t>
-            </w:r>
-          </w:p>
+              <w:t>print(x[0])</w:t>
+            </w:r>
+          </w:p>
+        </w:tc>
+        <w:tc>
+          <w:tcPr>
+            <w:tcW w:w="3258" w:type="dxa"/>
+          </w:tcPr>
+          <w:p/>
+        </w:tc>
+        <w:tc>
+          <w:tcPr>
+            <w:tcW w:w="3258" w:type="dxa"/>
+          </w:tcPr>
+          <w:p/>
         </w:tc>
       </w:tr>
       <w:tr>
@@ -515,15 +384,7 @@
               <w:t>x</w:t>
             </w:r>
             <w:r>
-              <w:t xml:space="preserve"> = </w:t>
-            </w:r>
-            <w:proofErr w:type="spellStart"/>
-            <w:r>
-              <w:t>df</w:t>
-            </w:r>
-            <w:proofErr w:type="spellEnd"/>
-            <w:r>
-              <w:t>['</w:t>
+              <w:t xml:space="preserve"> = df['</w:t>
             </w:r>
             <w:r>
               <w:t>id'</w:t>
@@ -546,15 +407,7 @@
               <w:t xml:space="preserve"> </w:t>
             </w:r>
             <w:r>
-              <w:t xml:space="preserve">= </w:t>
-            </w:r>
-            <w:proofErr w:type="spellStart"/>
-            <w:r>
-              <w:t>df</w:t>
-            </w:r>
-            <w:proofErr w:type="spellEnd"/>
-            <w:r>
-              <w:t>[x]</w:t>
+              <w:t>= df[x]</w:t>
             </w:r>
           </w:p>
           <w:p>
@@ -562,13 +415,8 @@
               <w:pStyle w:val="HTMLPreformatted"/>
             </w:pPr>
             <w:r>
-              <w:t>print(</w:t>
-            </w:r>
-            <w:proofErr w:type="gramStart"/>
-            <w:r>
-              <w:t>x[</w:t>
-            </w:r>
-            <w:proofErr w:type="gramEnd"/>
+              <w:t>print(x[</w:t>
+            </w:r>
             <w:r>
               <w:t>0:1</w:t>
             </w:r>
@@ -581,39 +429,13 @@
           <w:tcPr>
             <w:tcW w:w="3258" w:type="dxa"/>
           </w:tcPr>
-          <w:p>
-            <w:proofErr w:type="spellStart"/>
-            <w:r>
-              <w:t>Dataframe</w:t>
-            </w:r>
-            <w:proofErr w:type="spellEnd"/>
-            <w:r>
-              <w:t xml:space="preserve"> with two rows, </w:t>
-            </w:r>
-            <w:r>
-              <w:br/>
-              <w:t>101 Bob and 102 None</w:t>
-            </w:r>
-          </w:p>
-        </w:tc>
-        <w:tc>
-          <w:tcPr>
-            <w:tcW w:w="3258" w:type="dxa"/>
-          </w:tcPr>
-          <w:p>
-            <w:proofErr w:type="spellStart"/>
-            <w:r>
-              <w:t>Dataframe</w:t>
-            </w:r>
-            <w:proofErr w:type="spellEnd"/>
-            <w:r>
-              <w:t xml:space="preserve"> with one row, </w:t>
-            </w:r>
-            <w:r>
-              <w:br/>
-              <w:t>101, Bob</w:t>
-            </w:r>
-          </w:p>
+          <w:p/>
+        </w:tc>
+        <w:tc>
+          <w:tcPr>
+            <w:tcW w:w="3258" w:type="dxa"/>
+          </w:tcPr>
+          <w:p/>
         </w:tc>
       </w:tr>
       <w:tr>
@@ -629,13 +451,8 @@
             <w:pPr>
               <w:pStyle w:val="HTMLPreformatted"/>
             </w:pPr>
-            <w:proofErr w:type="spellStart"/>
-            <w:r>
-              <w:t>df</w:t>
-            </w:r>
-            <w:proofErr w:type="spellEnd"/>
-            <w:r>
-              <w:t xml:space="preserve">['sales'] = </w:t>
+            <w:r>
+              <w:t xml:space="preserve">df['sales'] = </w:t>
             </w:r>
             <w:r>
               <w:t>sales</w:t>
@@ -646,15 +463,7 @@
               <w:pStyle w:val="HTMLPreformatted"/>
             </w:pPr>
             <w:r>
-              <w:t xml:space="preserve">x = </w:t>
-            </w:r>
-            <w:proofErr w:type="spellStart"/>
-            <w:r>
-              <w:t>df</w:t>
-            </w:r>
-            <w:proofErr w:type="spellEnd"/>
-            <w:r>
-              <w:t>['sales']</w:t>
+              <w:t>x = df['sales']</w:t>
             </w:r>
             <w:r>
               <w:t xml:space="preserve"> &gt; 1</w:t>
@@ -665,46 +474,21 @@
               <w:pStyle w:val="HTMLPreformatted"/>
             </w:pPr>
             <w:r>
-              <w:t>print(</w:t>
-            </w:r>
-            <w:proofErr w:type="spellStart"/>
-            <w:r>
-              <w:t>df</w:t>
-            </w:r>
-            <w:proofErr w:type="spellEnd"/>
-            <w:r>
-              <w:t>[</w:t>
-            </w:r>
-            <w:r>
-              <w:t>'x'</w:t>
-            </w:r>
-            <w:r>
-              <w:t>]</w:t>
-            </w:r>
-            <w:r>
-              <w:t>)</w:t>
-            </w:r>
-          </w:p>
-        </w:tc>
-        <w:tc>
-          <w:tcPr>
-            <w:tcW w:w="3258" w:type="dxa"/>
-          </w:tcPr>
-          <w:p>
-            <w:r>
-              <w:t>False, True, True</w:t>
-            </w:r>
-          </w:p>
-        </w:tc>
-        <w:tc>
-          <w:tcPr>
-            <w:tcW w:w="3258" w:type="dxa"/>
-          </w:tcPr>
-          <w:p>
-            <w:r>
-              <w:t>Error</w:t>
-            </w:r>
-          </w:p>
+              <w:t>print(df['x'])</w:t>
+            </w:r>
+          </w:p>
+        </w:tc>
+        <w:tc>
+          <w:tcPr>
+            <w:tcW w:w="3258" w:type="dxa"/>
+          </w:tcPr>
+          <w:p/>
+        </w:tc>
+        <w:tc>
+          <w:tcPr>
+            <w:tcW w:w="3258" w:type="dxa"/>
+          </w:tcPr>
+          <w:p/>
         </w:tc>
       </w:tr>
       <w:tr>
@@ -720,26 +504,8 @@
             <w:pPr>
               <w:pStyle w:val="HTMLPreformatted"/>
             </w:pPr>
-            <w:proofErr w:type="spellStart"/>
-            <w:r>
-              <w:t>df</w:t>
-            </w:r>
-            <w:proofErr w:type="spellEnd"/>
-            <w:r>
-              <w:t>['name'</w:t>
-            </w:r>
-            <w:proofErr w:type="gramStart"/>
-            <w:r>
-              <w:t>].</w:t>
-            </w:r>
-            <w:proofErr w:type="spellStart"/>
-            <w:r>
-              <w:t>isnull</w:t>
-            </w:r>
-            <w:proofErr w:type="spellEnd"/>
-            <w:proofErr w:type="gramEnd"/>
-            <w:r>
-              <w:t>()</w:t>
+            <w:r>
+              <w:t>df['name'].isnull()</w:t>
             </w:r>
           </w:p>
           <w:p>
@@ -747,37 +513,21 @@
               <w:pStyle w:val="HTMLPreformatted"/>
             </w:pPr>
             <w:r>
-              <w:t>print(</w:t>
-            </w:r>
-            <w:proofErr w:type="spellStart"/>
-            <w:r>
-              <w:t>df</w:t>
-            </w:r>
-            <w:proofErr w:type="spellEnd"/>
-            <w:r>
-              <w:t>[x])</w:t>
-            </w:r>
-          </w:p>
-        </w:tc>
-        <w:tc>
-          <w:tcPr>
-            <w:tcW w:w="3258" w:type="dxa"/>
-          </w:tcPr>
-          <w:p>
-            <w:r>
-              <w:t>False, False, True</w:t>
-            </w:r>
-          </w:p>
-        </w:tc>
-        <w:tc>
-          <w:tcPr>
-            <w:tcW w:w="3258" w:type="dxa"/>
-          </w:tcPr>
-          <w:p>
-            <w:r>
-              <w:t>Prior result, as no assignment to x.</w:t>
-            </w:r>
-          </w:p>
+              <w:t>print(df[x])</w:t>
+            </w:r>
+          </w:p>
+        </w:tc>
+        <w:tc>
+          <w:tcPr>
+            <w:tcW w:w="3258" w:type="dxa"/>
+          </w:tcPr>
+          <w:p/>
+        </w:tc>
+        <w:tc>
+          <w:tcPr>
+            <w:tcW w:w="3258" w:type="dxa"/>
+          </w:tcPr>
+          <w:p/>
         </w:tc>
       </w:tr>
     </w:tbl>
@@ -793,7 +543,7 @@
 </file>
 
 <file path=word/styles.xml><?xml version="1.0" encoding="utf-8"?>
-<w:styles xmlns:mc="http://schemas.openxmlformats.org/markup-compatibility/2006" xmlns:r="http://schemas.openxmlformats.org/officeDocument/2006/relationships" xmlns:w="http://schemas.openxmlformats.org/wordprocessingml/2006/main" xmlns:w14="http://schemas.microsoft.com/office/word/2010/wordml" xmlns:w15="http://schemas.microsoft.com/office/word/2012/wordml" xmlns:w16cex="http://schemas.microsoft.com/office/word/2018/wordml/cex" xmlns:w16cid="http://schemas.microsoft.com/office/word/2016/wordml/cid" xmlns:w16="http://schemas.microsoft.com/office/word/2018/wordml" xmlns:w16du="http://schemas.microsoft.com/office/word/2023/wordml/word16du" xmlns:w16sdtdh="http://schemas.microsoft.com/office/word/2020/wordml/sdtdatahash" xmlns:w16sdtfl="http://schemas.microsoft.com/office/word/2024/wordml/sdtformatlock" xmlns:w16se="http://schemas.microsoft.com/office/word/2015/wordml/symex" mc:Ignorable="w14 w15 w16se w16cid w16 w16cex w16sdtdh w16sdtfl w16du">
+<w:styles xmlns:mc="http://schemas.openxmlformats.org/markup-compatibility/2006" xmlns:r="http://schemas.openxmlformats.org/officeDocument/2006/relationships" xmlns:w="http://schemas.openxmlformats.org/wordprocessingml/2006/main" xmlns:w14="http://schemas.microsoft.com/office/word/2010/wordml" xmlns:w15="http://schemas.microsoft.com/office/word/2012/wordml" xmlns:w16cex="http://schemas.microsoft.com/office/word/2018/wordml/cex" xmlns:w16cid="http://schemas.microsoft.com/office/word/2016/wordml/cid" xmlns:w16="http://schemas.microsoft.com/office/word/2018/wordml" xmlns:w16sdtdh="http://schemas.microsoft.com/office/word/2020/wordml/sdtdatahash" xmlns:w16sdtfl="http://schemas.microsoft.com/office/word/2024/wordml/sdtformatlock" xmlns:w16se="http://schemas.microsoft.com/office/word/2015/wordml/symex" xmlns:w16du="http://schemas.microsoft.com/office/word/2023/wordml/word16du" mc:Ignorable="w14 w15 w16se w16cid w16 w16cex w16sdtdh w16sdtfl w16du">
   <w:docDefaults>
     <w:rPrDefault>
       <w:rPr>

</xml_diff>